<commit_message>
Commentless GitLatch Commit @ 2023-11-20-19-5-27-683
</commit_message>
<xml_diff>
--- a/prueba.docx
+++ b/prueba.docx
@@ -3,6 +3,24 @@
 <w:document xmlns:wpc="http://schemas.microsoft.com/office/word/2010/wordprocessingCanvas" xmlns:cx="http://schemas.microsoft.com/office/drawing/2014/chartex" xmlns:cx1="http://schemas.microsoft.com/office/drawing/2015/9/8/chartex" xmlns:cx2="http://schemas.microsoft.com/office/drawing/2015/10/21/chartex" xmlns:cx3="http://schemas.microsoft.com/office/drawing/2016/5/9/chartex" xmlns:cx4="http://schemas.microsoft.com/office/drawing/2016/5/10/chartex" xmlns:cx5="http://schemas.microsoft.com/office/drawing/2016/5/11/chartex" xmlns:cx6="http://schemas.microsoft.com/office/drawing/2016/5/12/chartex" xmlns:cx7="http://schemas.microsoft.com/office/drawing/2016/5/13/chartex" xmlns:cx8="http://schemas.microsoft.com/office/drawing/2016/5/14/chartex" xmlns:mc="http://schemas.openxmlformats.org/markup-compatibility/2006" xmlns:aink="http://schemas.microsoft.com/office/drawing/2016/ink" xmlns:am3d="http://schemas.microsoft.com/office/drawing/2017/model3d" xmlns:o="urn:schemas-microsoft-com:office:office" xmlns:oel="http://schemas.microsoft.com/office/2019/extlst" xmlns:r="http://schemas.openxmlformats.org/officeDocument/2006/relationships" xmlns:m="http://schemas.openxmlformats.org/officeDocument/2006/math" xmlns:v="urn:schemas-microsoft-com:vml" xmlns:wp14="http://schemas.microsoft.com/office/word/2010/wordprocessingDrawing" xmlns:wp="http://schemas.openxmlformats.org/drawingml/2006/wordprocessingDrawing" xmlns:w10="urn:schemas-microsoft-com:office:word" xmlns:w="http://schemas.openxmlformats.org/wordprocessingml/2006/main" xmlns:w14="http://schemas.microsoft.com/office/word/2010/wordml" xmlns:w15="http://schemas.microsoft.com/office/word/2012/wordml" xmlns:w16cex="http://schemas.microsoft.com/office/word/2018/wordml/cex" xmlns:w16cid="http://schemas.microsoft.com/office/word/2016/wordml/cid" xmlns:w16="http://schemas.microsoft.com/office/word/2018/wordml" xmlns:w16sdtdh="http://schemas.microsoft.com/office/word/2020/wordml/sdtdatahash" xmlns:w16se="http://schemas.microsoft.com/office/word/2015/wordml/symex" xmlns:wpg="http://schemas.microsoft.com/office/word/2010/wordprocessingGroup" xmlns:wpi="http://schemas.microsoft.com/office/word/2010/wordprocessingInk" xmlns:wne="http://schemas.microsoft.com/office/word/2006/wordml" xmlns:wps="http://schemas.microsoft.com/office/word/2010/wordprocessingShape" mc:Ignorable="w14 w15 w16se w16cid w16 w16cex w16sdtdh wp14">
   <w:body>
     <w:p/>
+    <w:p>
+      <w:r>
+        <w:t xml:space="preserve">Hola </w:t>
+      </w:r>
+      <w:proofErr w:type="spellStart"/>
+      <w:r>
+        <w:t>buenas</w:t>
+      </w:r>
+      <w:proofErr w:type="spellEnd"/>
+      <w:r>
+        <w:t xml:space="preserve"> </w:t>
+      </w:r>
+      <w:proofErr w:type="spellStart"/>
+      <w:r>
+        <w:t>tardes</w:t>
+      </w:r>
+      <w:proofErr w:type="spellEnd"/>
+    </w:p>
     <w:p/>
     <w:sectPr>
       <w:pgSz w:w="11906" w:h="16838"/>
@@ -752,10 +770,10 @@
 </file>
 
 <file path=word/webextensions/webextension1.xml><?xml version="1.0" encoding="utf-8"?>
-<we:webextension xmlns:we="http://schemas.microsoft.com/office/webextensions/webextension/2010/11" id="{DD554DAD-E0D9-4FE4-9DE1-A5F13B058DCF}">
+<we:webextension xmlns:we="http://schemas.microsoft.com/office/webextensions/webextension/2010/11" id="{5D3CB861-C0BB-4FB2-ADF8-2A4A3282D119}">
   <we:reference id="wa200004780" version="1.0.0.3" store="es-ES" storeType="OMEX"/>
   <we:alternateReferences>
-    <we:reference id="WA200004780" version="1.0.0.3" store="WA200004780" storeType="OMEX"/>
+    <we:reference id="wa200004780" version="1.0.0.3" store="WA200004780" storeType="OMEX"/>
   </we:alternateReferences>
   <we:properties>
     <we:property name="Office.AutoShowTaskpaneWithDocument" value="true"/>

</xml_diff>

<commit_message>
Commentless GitLatch Commit @ 2023-11-20-19-6-21-798
</commit_message>
<xml_diff>
--- a/prueba.docx
+++ b/prueba.docx
@@ -2,24 +2,10 @@
 <file path=word/document.xml><?xml version="1.0" encoding="utf-8"?>
 <w:document xmlns:wpc="http://schemas.microsoft.com/office/word/2010/wordprocessingCanvas" xmlns:cx="http://schemas.microsoft.com/office/drawing/2014/chartex" xmlns:cx1="http://schemas.microsoft.com/office/drawing/2015/9/8/chartex" xmlns:cx2="http://schemas.microsoft.com/office/drawing/2015/10/21/chartex" xmlns:cx3="http://schemas.microsoft.com/office/drawing/2016/5/9/chartex" xmlns:cx4="http://schemas.microsoft.com/office/drawing/2016/5/10/chartex" xmlns:cx5="http://schemas.microsoft.com/office/drawing/2016/5/11/chartex" xmlns:cx6="http://schemas.microsoft.com/office/drawing/2016/5/12/chartex" xmlns:cx7="http://schemas.microsoft.com/office/drawing/2016/5/13/chartex" xmlns:cx8="http://schemas.microsoft.com/office/drawing/2016/5/14/chartex" xmlns:mc="http://schemas.openxmlformats.org/markup-compatibility/2006" xmlns:aink="http://schemas.microsoft.com/office/drawing/2016/ink" xmlns:am3d="http://schemas.microsoft.com/office/drawing/2017/model3d" xmlns:o="urn:schemas-microsoft-com:office:office" xmlns:oel="http://schemas.microsoft.com/office/2019/extlst" xmlns:r="http://schemas.openxmlformats.org/officeDocument/2006/relationships" xmlns:m="http://schemas.openxmlformats.org/officeDocument/2006/math" xmlns:v="urn:schemas-microsoft-com:vml" xmlns:wp14="http://schemas.microsoft.com/office/word/2010/wordprocessingDrawing" xmlns:wp="http://schemas.openxmlformats.org/drawingml/2006/wordprocessingDrawing" xmlns:w10="urn:schemas-microsoft-com:office:word" xmlns:w="http://schemas.openxmlformats.org/wordprocessingml/2006/main" xmlns:w14="http://schemas.microsoft.com/office/word/2010/wordml" xmlns:w15="http://schemas.microsoft.com/office/word/2012/wordml" xmlns:w16cex="http://schemas.microsoft.com/office/word/2018/wordml/cex" xmlns:w16cid="http://schemas.microsoft.com/office/word/2016/wordml/cid" xmlns:w16="http://schemas.microsoft.com/office/word/2018/wordml" xmlns:w16sdtdh="http://schemas.microsoft.com/office/word/2020/wordml/sdtdatahash" xmlns:w16se="http://schemas.microsoft.com/office/word/2015/wordml/symex" xmlns:wpg="http://schemas.microsoft.com/office/word/2010/wordprocessingGroup" xmlns:wpi="http://schemas.microsoft.com/office/word/2010/wordprocessingInk" xmlns:wne="http://schemas.microsoft.com/office/word/2006/wordml" xmlns:wps="http://schemas.microsoft.com/office/word/2010/wordprocessingShape" mc:Ignorable="w14 w15 w16se w16cid w16 w16cex w16sdtdh wp14">
   <w:body>
-    <w:p/>
     <w:p>
       <w:r>
-        <w:t xml:space="preserve">Hola </w:t>
+        <w:t>hola</w:t>
       </w:r>
-      <w:proofErr w:type="spellStart"/>
-      <w:r>
-        <w:t>buenas</w:t>
-      </w:r>
-      <w:proofErr w:type="spellEnd"/>
-      <w:r>
-        <w:t xml:space="preserve"> </w:t>
-      </w:r>
-      <w:proofErr w:type="spellStart"/>
-      <w:r>
-        <w:t>tardes</w:t>
-      </w:r>
-      <w:proofErr w:type="spellEnd"/>
     </w:p>
     <w:p/>
     <w:sectPr>
@@ -770,7 +756,7 @@
 </file>
 
 <file path=word/webextensions/webextension1.xml><?xml version="1.0" encoding="utf-8"?>
-<we:webextension xmlns:we="http://schemas.microsoft.com/office/webextensions/webextension/2010/11" id="{5D3CB861-C0BB-4FB2-ADF8-2A4A3282D119}">
+<we:webextension xmlns:we="http://schemas.microsoft.com/office/webextensions/webextension/2010/11" id="{D4F4F859-BEC2-4A3E-BF9A-DC4252164EDD}">
   <we:reference id="wa200004780" version="1.0.0.3" store="es-ES" storeType="OMEX"/>
   <we:alternateReferences>
     <we:reference id="wa200004780" version="1.0.0.3" store="WA200004780" storeType="OMEX"/>

</xml_diff>